<commit_message>
fix(docs): resolve signature and logo rendering issues in DOCX exports
- Sterilized DOCX templates (reconstructed logo tags, renamed code/version tags, stitched fragmented runs)
- Fixed missing firma keys in doc.setData for verbale_riunione
- Fixed fallback logic to properly use firmaImmagine instead of non-existent firmaDigitale
- Exposed firmaImmagine and firmaNome in docx-generator's getGlobalSettings
</commit_message>
<xml_diff>
--- a/templates/verbale_riunione_coordinamento.docx
+++ b/templates/verbale_riunione_coordinamento.docx
@@ -1496,7 +1496,7 @@
               <w:szCs w:val="22"/>
               <w:shd w:fill="FFFFFF" w:val="clear"/>
             </w:rPr>
-            <w:t>{codice}</w:t>
+            <w:t>{modulo_codice}</w:t>
           </w:r>
         </w:p>
       </w:tc>
@@ -1617,7 +1617,7 @@
               <w:szCs w:val="22"/>
               <w:shd w:fill="FFFFFF" w:val="clear"/>
             </w:rPr>
-            <w:t>{versione e data}</w:t>
+            <w:t>{modulo_versione}</w:t>
           </w:r>
         </w:p>
       </w:tc>
@@ -1871,7 +1871,7 @@
               <w:szCs w:val="22"/>
               <w:shd w:fill="FFFFFF" w:val="clear"/>
             </w:rPr>
-            <w:t>{codice}</w:t>
+            <w:t>{modulo_codice}</w:t>
           </w:r>
         </w:p>
       </w:tc>
@@ -1992,7 +1992,7 @@
               <w:szCs w:val="22"/>
               <w:shd w:fill="FFFFFF" w:val="clear"/>
             </w:rPr>
-            <w:t>{versione e data}</w:t>
+            <w:t>{modulo_versione}</w:t>
           </w:r>
         </w:p>
       </w:tc>

</xml_diff>

<commit_message>
fix(template): aggiungi {%firma_image} nei loop presenti RIUNIONE
Nei loop {#presenti_sicurezza} e {#presenti_imprese} del verbale
riunione mancava il tag {%firma_image}. Il JS passava già firma_image
per ogni partecipante ma il template non aveva il segnaposto.

Co-Authored-By: Claude Sonnet 4.6 <noreply@anthropic.com>
</commit_message>
<xml_diff>
--- a/templates/verbale_riunione_coordinamento.docx
+++ b/templates/verbale_riunione_coordinamento.docx
@@ -305,6 +305,16 @@
             </w:pPr>
             <w:r>
               <w:rPr/>
+              <w:t>{%firma_image}</w:t>
+            </w:r>
+          </w:p>
+          <w:p>
+            <w:pPr>
+              <w:pStyle w:val="Normal"/>
+              <w:rPr/>
+            </w:pPr>
+            <w:r>
+              <w:rPr/>
               <w:t>{/presenti_sicurezza}</w:t>
             </w:r>
           </w:p>
@@ -338,6 +348,16 @@
             <w:r>
               <w:rPr/>
               <w:t>{ragione_sociale}</w:t>
+            </w:r>
+          </w:p>
+          <w:p>
+            <w:pPr>
+              <w:pStyle w:val="Normal"/>
+              <w:rPr/>
+            </w:pPr>
+            <w:r>
+              <w:rPr/>
+              <w:t>{%firma_image}</w:t>
             </w:r>
           </w:p>
           <w:p>

</xml_diff>